<commit_message>
libonyxposix: read (0) honours O_NONBLOCK when stdin is a pipe (Jet's downloads window froze after a Cancel: its close button did nothing)
The console descriptor's read called kapi_stdin_read, which waits, whatever the flag: a helper window
that reads its stdin each tick (Jet's downloads, its console) stopped pumping its events as soon as
the browser had nothing more to say.

Co-Authored-By: Claude Opus 5.5 <noreply@anthropic.com>
</commit_message>
<xml_diff>
--- a/docs/exports/08-WEBKIT-PORT.docx
+++ b/docs/exports/08-WEBKIT-PORT.docx
@@ -9150,7 +9150,67 @@
         <w:t xml:space="preserve">user/libc/posix/proc.c</w:t>
       </w:r>
       <w:r>
-        <w:t xml:space="preserve">, docs/03 §5.4). Web also serves Mail as its HTML view</w:t>
+        <w:t xml:space="preserve">, docs/03 §5.4). A third, 2026-10-04: the downloads' window</w:t>
+      </w:r>
+      <w:r>
+        <w:t xml:space="preserve"> </w:t>
+      </w:r>
+      <w:r>
+        <w:t xml:space="preserve">(and the console's) froze once the browser had nothing more to tell it — after a Cancel, its close</w:t>
+      </w:r>
+      <w:r>
+        <w:t xml:space="preserve"> </w:t>
+      </w:r>
+      <w:r>
+        <w:t xml:space="preserve">button did nothing:</w:t>
+      </w:r>
+      <w:r>
+        <w:t xml:space="preserve"> </w:t>
+      </w:r>
+      <w:r>
+        <w:rPr>
+          <w:rStyle w:val="VerbatimChar"/>
+        </w:rPr>
+        <w:t xml:space="preserve">read (0)</w:t>
+      </w:r>
+      <w:r>
+        <w:t xml:space="preserve"> </w:t>
+      </w:r>
+      <w:r>
+        <w:t xml:space="preserve">waited although the descriptor was</w:t>
+      </w:r>
+      <w:r>
+        <w:t xml:space="preserve"> </w:t>
+      </w:r>
+      <w:r>
+        <w:rPr>
+          <w:rStyle w:val="VerbatimChar"/>
+        </w:rPr>
+        <w:t xml:space="preserve">O_NONBLOCK</w:t>
+      </w:r>
+      <w:r>
+        <w:t xml:space="preserve"> </w:t>
+      </w:r>
+      <w:r>
+        <w:t xml:space="preserve">(libonyxposix's console</w:t>
+      </w:r>
+      <w:r>
+        <w:t xml:space="preserve"> </w:t>
+      </w:r>
+      <w:r>
+        <w:t xml:space="preserve">descriptor ignored the flag:</w:t>
+      </w:r>
+      <w:r>
+        <w:t xml:space="preserve"> </w:t>
+      </w:r>
+      <w:r>
+        <w:rPr>
+          <w:rStyle w:val="VerbatimChar"/>
+        </w:rPr>
+        <w:t xml:space="preserve">user/libc/posix/file.c</w:t>
+      </w:r>
+      <w:r>
+        <w:t xml:space="preserve">). Web also serves Mail as its HTML view</w:t>
       </w:r>
       <w:r>
         <w:t xml:space="preserve"> </w:t>

</xml_diff>

<commit_message>
tools/build-jet.sh: build Jet Browser from its sources (WebKit at the pin + Onyx's patches, third_party's libraries) and stage it; docs/03, docs/08, exports
Co-Authored-By: Claude Opus 5.5 <noreply@anthropic.com>
Claude-Session: https://claude.ai/code/session_01Sg2N4fYoZ5LPNycfebnmWQ
</commit_message>
<xml_diff>
--- a/docs/exports/08-WEBKIT-PORT.docx
+++ b/docs/exports/08-WEBKIT-PORT.docx
@@ -4343,6 +4343,240 @@
       </w:pPr>
       <w:r>
         <w:t xml:space="preserve">Resume</w:t>
+      </w:r>
+    </w:p>
+    <w:p>
+      <w:pPr>
+        <w:pStyle w:val="FirstParagraph"/>
+      </w:pPr>
+      <w:r>
+        <w:rPr>
+          <w:bCs/>
+          <w:b/>
+        </w:rPr>
+        <w:t xml:space="preserve">From a fresh clone, in one command:</w:t>
+      </w:r>
+      <w:r>
+        <w:rPr>
+          <w:bCs/>
+          <w:b/>
+        </w:rPr>
+        <w:t xml:space="preserve"> </w:t>
+      </w:r>
+      <w:r>
+        <w:rPr>
+          <w:rStyle w:val="VerbatimChar"/>
+          <w:bCs/>
+          <w:b/>
+        </w:rPr>
+        <w:t xml:space="preserve">sh tools/build-jet.sh</w:t>
+      </w:r>
+      <w:r>
+        <w:t xml:space="preserve"> </w:t>
+      </w:r>
+      <w:r>
+        <w:t xml:space="preserve">[</w:t>
+      </w:r>
+      <w:r>
+        <w:rPr>
+          <w:rStyle w:val="VerbatimChar"/>
+        </w:rPr>
+        <w:t xml:space="preserve">--no-jit</w:t>
+      </w:r>
+      <w:r>
+        <w:t xml:space="preserve">] [</w:t>
+      </w:r>
+      <w:r>
+        <w:rPr>
+          <w:rStyle w:val="VerbatimChar"/>
+        </w:rPr>
+        <w:t xml:space="preserve">--jobs N</w:t>
+      </w:r>
+      <w:r>
+        <w:t xml:space="preserve">] (Linux x86_64 or</w:t>
+      </w:r>
+      <w:r>
+        <w:t xml:space="preserve"> </w:t>
+      </w:r>
+      <w:r>
+        <w:t xml:space="preserve">WSL 2). It builds Onyx first (</w:t>
+      </w:r>
+      <w:r>
+        <w:rPr>
+          <w:rStyle w:val="VerbatimChar"/>
+        </w:rPr>
+        <w:t xml:space="preserve">tools/build-sdcard.sh</w:t>
+      </w:r>
+      <w:r>
+        <w:t xml:space="preserve">), fetches the</w:t>
+      </w:r>
+      <w:r>
+        <w:t xml:space="preserve"> </w:t>
+      </w:r>
+      <w:r>
+        <w:rPr>
+          <w:rStyle w:val="VerbatimChar"/>
+        </w:rPr>
+        <w:t xml:space="preserve">aarch64-onyx-elf</w:t>
+      </w:r>
+      <w:r>
+        <w:t xml:space="preserve"> </w:t>
+      </w:r>
+      <w:r>
+        <w:t xml:space="preserve">toolchain, installs</w:t>
+      </w:r>
+      <w:r>
+        <w:t xml:space="preserve"> </w:t>
+      </w:r>
+      <w:r>
+        <w:t xml:space="preserve">the POSIX sysroot, builds the libraries from</w:t>
+      </w:r>
+      <w:r>
+        <w:t xml:space="preserve"> </w:t>
+      </w:r>
+      <w:r>
+        <w:rPr>
+          <w:rStyle w:val="VerbatimChar"/>
+        </w:rPr>
+        <w:t xml:space="preserve">third_party/</w:t>
+      </w:r>
+      <w:r>
+        <w:t xml:space="preserve"> </w:t>
+      </w:r>
+      <w:r>
+        <w:t xml:space="preserve">(</w:t>
+      </w:r>
+      <w:r>
+        <w:rPr>
+          <w:rStyle w:val="VerbatimChar"/>
+        </w:rPr>
+        <w:t xml:space="preserve">tools/ports/build-all.sh</w:t>
+      </w:r>
+      <w:r>
+        <w:t xml:space="preserve">), fetches WebKit at</w:t>
+      </w:r>
+      <w:r>
+        <w:t xml:space="preserve"> </w:t>
+      </w:r>
+      <w:r>
+        <w:t xml:space="preserve">the pin with the patch series (</w:t>
+      </w:r>
+      <w:r>
+        <w:rPr>
+          <w:rStyle w:val="VerbatimChar"/>
+        </w:rPr>
+        <w:t xml:space="preserve">fetch.sh</w:t>
+      </w:r>
+      <w:r>
+        <w:t xml:space="preserve">,</w:t>
+      </w:r>
+      <w:r>
+        <w:t xml:space="preserve"> </w:t>
+      </w:r>
+      <w:r>
+        <w:rPr>
+          <w:rStyle w:val="VerbatimChar"/>
+        </w:rPr>
+        <w:t xml:space="preserve">TESTS=0</w:t>
+      </w:r>
+      <w:r>
+        <w:t xml:space="preserve">), builds WebKit with the JIT as the package is built</w:t>
+      </w:r>
+      <w:r>
+        <w:t xml:space="preserve"> </w:t>
+      </w:r>
+      <w:r>
+        <w:t xml:space="preserve">(</w:t>
+      </w:r>
+      <w:r>
+        <w:rPr>
+          <w:rStyle w:val="VerbatimChar"/>
+        </w:rPr>
+        <w:t xml:space="preserve">BUILD=&lt;WEBKIT_DIR&gt;-build/webkit-jit</w:t>
+      </w:r>
+      <w:r>
+        <w:t xml:space="preserve">,</w:t>
+      </w:r>
+      <w:r>
+        <w:t xml:space="preserve"> </w:t>
+      </w:r>
+      <w:r>
+        <w:rPr>
+          <w:rStyle w:val="VerbatimChar"/>
+        </w:rPr>
+        <w:t xml:space="preserve">CMAKE_EXTRA="-DONYX_WEBKIT=ON -DENABLE_JIT=ON -DENABLE_DFG_JIT=ON -DENABLE_FTL_JIT=OFF"</w:t>
+      </w:r>
+      <w:r>
+        <w:t xml:space="preserve">,</w:t>
+      </w:r>
+      <w:r>
+        <w:t xml:space="preserve"> </w:t>
+      </w:r>
+      <w:r>
+        <w:rPr>
+          <w:rStyle w:val="VerbatimChar"/>
+        </w:rPr>
+        <w:t xml:space="preserve">TARGET=WebKit</w:t>
+      </w:r>
+      <w:r>
+        <w:t xml:space="preserve">), then Jet (</w:t>
+      </w:r>
+      <w:r>
+        <w:rPr>
+          <w:rStyle w:val="VerbatimChar"/>
+        </w:rPr>
+        <w:t xml:space="preserve">build-web.sh</w:t>
+      </w:r>
+      <w:r>
+        <w:t xml:space="preserve"> </w:t>
+      </w:r>
+      <w:r>
+        <w:t xml:space="preserve">→</w:t>
+      </w:r>
+      <w:r>
+        <w:t xml:space="preserve"> </w:t>
+      </w:r>
+      <w:r>
+        <w:rPr>
+          <w:rStyle w:val="VerbatimChar"/>
+        </w:rPr>
+        <w:t xml:space="preserve">sdcard/apps/jet.app/main</w:t>
+      </w:r>
+      <w:r>
+        <w:t xml:space="preserve">). Each step</w:t>
+      </w:r>
+      <w:r>
+        <w:t xml:space="preserve"> </w:t>
+      </w:r>
+      <w:r>
+        <w:t xml:space="preserve">is skipped when done: a second run continues. The host packages it asks for:</w:t>
+      </w:r>
+      <w:r>
+        <w:t xml:space="preserve"> </w:t>
+      </w:r>
+      <w:r>
+        <w:rPr>
+          <w:rStyle w:val="VerbatimChar"/>
+        </w:rPr>
+        <w:t xml:space="preserve">git build-essential python3 perl ruby gperf unifdef cmake ninja-build curl xz-utils bison flex pkg-config</w:t>
+      </w:r>
+      <w:r>
+        <w:t xml:space="preserve"> </w:t>
+      </w:r>
+      <w:r>
+        <w:t xml:space="preserve">(+</w:t>
+      </w:r>
+      <w:r>
+        <w:t xml:space="preserve"> </w:t>
+      </w:r>
+      <w:r>
+        <w:rPr>
+          <w:rStyle w:val="VerbatimChar"/>
+        </w:rPr>
+        <w:t xml:space="preserve">ccache</w:t>
+      </w:r>
+      <w:r>
+        <w:t xml:space="preserve">). The steps by hand:</w:t>
       </w:r>
     </w:p>
     <w:p>

</xml_diff>